<commit_message>
Mantenimiento: la visita prueba también los relés de selección y el sensor
Co-Authored-By: Claude Opus 5.5 <noreply@anthropic.com>
Claude-Session: https://claude.ai/code/session_01QiY8ZZNAM9gwPKiqSkCaaj
</commit_message>
<xml_diff>
--- a/documentacion_proyecto/Estimacion_Costos_Ganancia_Contrato_v4.docx
+++ b/documentacion_proyecto/Estimacion_Costos_Ganancia_Contrato_v4.docx
@@ -10148,7 +10148,7 @@
                 <w:szCs w:val="24"/>
                 <w:rtl w:val="0"/>
               </w:rPr>
-              <w:t xml:space="preserve">Todo lo del plan Básico, más una visita presencial de inspección: revisión del gabinete y la pelusa acumulada, medición de la fuente, prueba de los 3 relés y del sensado, revisión de cables y prensacables.</w:t>
+              <w:t xml:space="preserve">Todo lo del plan Básico, más una visita presencial de inspección: revisión del gabinete y la pelusa acumulada, medición de la fuente, prueba de los 3 relés de la botonera, de los 4 relés de selección LCA110, del sensor de pasada y del sensado, revisión de cables y prensacables.</w:t>
             </w:r>
           </w:p>
         </w:tc>
@@ -10466,7 +10466,7 @@
                 <w:szCs w:val="24"/>
                 <w:rtl w:val="0"/>
               </w:rPr>
-              <w:t xml:space="preserve">No incluidos en ningún plan: se facturan aparte al costo del componente. Referencia: módulos de relé $5.000 · fuente HLK-5M05 $7.000 · ESP32 $12.203 · fusibles ~$800.</w:t>
+              <w:t xml:space="preserve">No incluidos en ningún plan: se facturan aparte al costo del componente. Referencia: módulos de relé $5.000 · fuente HLK-5M05 $7.000 · ESP32 $12.203 · relé LCA110 $6.034 · sensor inductivo $7.000 · fusibles ~$800.</w:t>
             </w:r>
           </w:p>
         </w:tc>

</xml_diff>